<commit_message>
cambios en modelo conformidad
</commit_message>
<xml_diff>
--- a/Modelos_documentos/CONFORMIDAD TERCERO - MODELO.docx
+++ b/Modelos_documentos/CONFORMIDAD TERCERO - MODELO.docx
@@ -167,7 +167,7 @@
           <w:sz w:val="24"/>
           <w:szCs w:val="24"/>
         </w:rPr>
-        <w:t>19 de junio de 2025</w:t>
+        <w:t>18 de julio de 2025</w:t>
       </w:r>
       <w:r>
         <w:rPr>
@@ -525,6 +525,7 @@
         </w:rPr>
         <w:t xml:space="preserve"> </w:t>
       </w:r>
+      <w:proofErr w:type="spellStart"/>
       <w:r>
         <w:rPr>
           <w:rFonts w:ascii="Garamond" w:hAnsi="Garamond" w:cs="Arial"/>
@@ -535,6 +536,7 @@
         </w:rPr>
         <w:t>descripcion_cursos</w:t>
       </w:r>
+      <w:proofErr w:type="spellEnd"/>
       <w:r>
         <w:rPr>
           <w:rFonts w:ascii="Garamond" w:hAnsi="Garamond" w:cs="Arial"/>
@@ -658,7 +660,7 @@
           <w:sz w:val="24"/>
           <w:szCs w:val="24"/>
         </w:rPr>
-        <w:t>numero_orden</w:t>
+        <w:t>_________</w:t>
       </w:r>
       <w:r>
         <w:rPr>
@@ -695,28 +697,39 @@
         </w:rPr>
         <w:t xml:space="preserve"> de </w:t>
       </w:r>
+      <w:proofErr w:type="spellStart"/>
       <w:r>
         <w:rPr>
           <w:rFonts w:ascii="Garamond" w:hAnsi="Garamond" w:cs="Adobe Devanagari"/>
           <w:sz w:val="24"/>
           <w:szCs w:val="24"/>
         </w:rPr>
-        <w:t>monto_subtotal,</w:t>
-      </w:r>
-      <w:r>
-        <w:rPr>
-          <w:rFonts w:ascii="Garamond" w:hAnsi="Garamond"/>
-        </w:rPr>
-        <w:t xml:space="preserve"> </w:t>
-      </w:r>
+        <w:t>monto_subtotal</w:t>
+      </w:r>
+      <w:proofErr w:type="spellEnd"/>
       <w:r>
         <w:rPr>
           <w:rFonts w:ascii="Garamond" w:hAnsi="Garamond" w:cs="Adobe Devanagari"/>
           <w:sz w:val="24"/>
           <w:szCs w:val="24"/>
         </w:rPr>
+        <w:t>,</w:t>
+      </w:r>
+      <w:r>
+        <w:rPr>
+          <w:rFonts w:ascii="Garamond" w:hAnsi="Garamond"/>
+        </w:rPr>
+        <w:t xml:space="preserve"> </w:t>
+      </w:r>
+      <w:r>
+        <w:rPr>
+          <w:rFonts w:ascii="Garamond" w:hAnsi="Garamond" w:cs="Adobe Devanagari"/>
+          <w:sz w:val="24"/>
+          <w:szCs w:val="24"/>
+        </w:rPr>
         <w:t xml:space="preserve">monto por hora: </w:t>
       </w:r>
+      <w:proofErr w:type="spellStart"/>
       <w:r>
         <w:rPr>
           <w:rFonts w:ascii="Garamond" w:hAnsi="Garamond" w:cs="Adobe Devanagari"/>
@@ -725,6 +738,7 @@
         </w:rPr>
         <w:t>monto_hora</w:t>
       </w:r>
+      <w:proofErr w:type="spellEnd"/>
       <w:r>
         <w:rPr>
           <w:rFonts w:ascii="Garamond" w:hAnsi="Garamond" w:cs="Adobe Devanagari"/>

</xml_diff>